<commit_message>
add Kibana logging with elastic
</commit_message>
<xml_diff>
--- a/HLD.docx
+++ b/HLD.docx
@@ -276,15 +276,7 @@
       </w:r>
       <w:proofErr w:type="gramEnd"/>
       <w:r>
-        <w:t xml:space="preserve">Create </w:t>
-      </w:r>
-      <w:proofErr w:type="spellStart"/>
-      <w:r>
-        <w:t>RequestId</w:t>
-      </w:r>
-      <w:proofErr w:type="spellEnd"/>
-      <w:r>
-        <w:t xml:space="preserve"> + Save "Pending")</w:t>
+        <w:t>Create RequestId + Save "Pending")</w:t>
       </w:r>
       <w:r>
         <w:t xml:space="preserve"> =&gt;</w:t>
@@ -351,24 +343,8 @@
           <w:b/>
           <w:bCs/>
         </w:rPr>
-        <w:t>array manipulation</w:t>
-      </w:r>
-      <w:r>
-        <w:rPr>
-          <w:b/>
-          <w:bCs/>
-        </w:rPr>
-        <w:t xml:space="preserve"> </w:t>
-      </w:r>
-      <w:proofErr w:type="spellStart"/>
-      <w:r>
-        <w:rPr>
-          <w:b/>
-          <w:bCs/>
-        </w:rPr>
-        <w:t>approch</w:t>
-      </w:r>
-      <w:proofErr w:type="spellEnd"/>
+        <w:t>array manipulation approch</w:t>
+      </w:r>
     </w:p>
     <w:p>
       <w:pPr>
@@ -394,16 +370,8 @@
           <w:numId w:val="6"/>
         </w:numPr>
       </w:pPr>
-      <w:proofErr w:type="spellStart"/>
-      <w:r>
-        <w:t>M</w:t>
-      </w:r>
-      <w:r>
-        <w:t>reate</w:t>
-      </w:r>
-      <w:proofErr w:type="spellEnd"/>
-      <w:r>
-        <w:t xml:space="preserve"> a new array with zero value same length</w:t>
+      <w:r>
+        <w:t>Mreate a new array with zero value same length</w:t>
       </w:r>
     </w:p>
     <w:p>
@@ -487,11 +455,9 @@
           <w:numId w:val="3"/>
         </w:numPr>
       </w:pPr>
-      <w:proofErr w:type="spellStart"/>
       <w:r>
         <w:t>Streaming.Producer.API</w:t>
       </w:r>
-      <w:proofErr w:type="spellEnd"/>
     </w:p>
     <w:p>
       <w:r>
@@ -509,61 +475,27 @@
       </w:r>
       <w:proofErr w:type="gramEnd"/>
       <w:r>
-        <w:t xml:space="preserve"> the request save in </w:t>
-      </w:r>
-      <w:proofErr w:type="spellStart"/>
-      <w:r>
-        <w:t>NoSql</w:t>
-      </w:r>
-      <w:proofErr w:type="spellEnd"/>
+        <w:t xml:space="preserve"> the request save in NoSql db and publish the message in RabbitMq for asyn </w:t>
+      </w:r>
+      <w:proofErr w:type="gramStart"/>
+      <w:r>
+        <w:t>process .</w:t>
+      </w:r>
+      <w:proofErr w:type="gramEnd"/>
+      <w:r>
+        <w:t xml:space="preserve"> It </w:t>
+      </w:r>
+      <w:proofErr w:type="gramStart"/>
+      <w:r>
+        <w:t>return</w:t>
+      </w:r>
+      <w:proofErr w:type="gramEnd"/>
       <w:r>
         <w:t xml:space="preserve"> </w:t>
       </w:r>
-      <w:proofErr w:type="spellStart"/>
-      <w:r>
-        <w:t>db</w:t>
-      </w:r>
-      <w:proofErr w:type="spellEnd"/>
-      <w:r>
-        <w:t xml:space="preserve"> and publish the message in </w:t>
-      </w:r>
-      <w:proofErr w:type="spellStart"/>
-      <w:r>
-        <w:t>RabbitMq</w:t>
-      </w:r>
-      <w:proofErr w:type="spellEnd"/>
-      <w:r>
-        <w:t xml:space="preserve"> for </w:t>
-      </w:r>
-      <w:proofErr w:type="spellStart"/>
-      <w:r>
-        <w:t>asyn</w:t>
-      </w:r>
-      <w:proofErr w:type="spellEnd"/>
-      <w:r>
-        <w:t xml:space="preserve"> </w:t>
-      </w:r>
-      <w:proofErr w:type="gramStart"/>
-      <w:r>
-        <w:t>process .</w:t>
-      </w:r>
-      <w:proofErr w:type="gramEnd"/>
-      <w:r>
-        <w:t xml:space="preserve"> It </w:t>
-      </w:r>
-      <w:proofErr w:type="gramStart"/>
-      <w:r>
-        <w:t>return</w:t>
-      </w:r>
-      <w:proofErr w:type="gramEnd"/>
-      <w:r>
-        <w:t xml:space="preserve"> </w:t>
-      </w:r>
-      <w:proofErr w:type="spellStart"/>
       <w:r>
         <w:t>processId</w:t>
       </w:r>
-      <w:proofErr w:type="spellEnd"/>
       <w:r>
         <w:t xml:space="preserve"> with status as </w:t>
       </w:r>
@@ -595,23 +527,7 @@
           <w:sz w:val="20"/>
           <w:szCs w:val="20"/>
         </w:rPr>
-        <w:t xml:space="preserve">: </w:t>
-      </w:r>
-      <w:proofErr w:type="spellStart"/>
-      <w:r>
-        <w:rPr>
-          <w:sz w:val="20"/>
-          <w:szCs w:val="20"/>
-        </w:rPr>
-        <w:t>api</w:t>
-      </w:r>
-      <w:proofErr w:type="spellEnd"/>
-      <w:r>
-        <w:rPr>
-          <w:sz w:val="20"/>
-          <w:szCs w:val="20"/>
-        </w:rPr>
-        <w:t>/stream/process</w:t>
+        <w:t>: api/stream/process</w:t>
       </w:r>
     </w:p>
     <w:p>
@@ -755,23 +671,7 @@
           <w:sz w:val="20"/>
           <w:szCs w:val="20"/>
         </w:rPr>
-        <w:t>"</w:t>
-      </w:r>
-      <w:proofErr w:type="spellStart"/>
-      <w:r>
-        <w:rPr>
-          <w:sz w:val="20"/>
-          <w:szCs w:val="20"/>
-        </w:rPr>
-        <w:t>processId</w:t>
-      </w:r>
-      <w:proofErr w:type="spellEnd"/>
-      <w:r>
-        <w:rPr>
-          <w:sz w:val="20"/>
-          <w:szCs w:val="20"/>
-        </w:rPr>
-        <w:t>": "a8b704a3-8da0-435f-872a-ff1845b41c8c",</w:t>
+        <w:t>"processId": "a8b704a3-8da0-435f-872a-ff1845b41c8c",</w:t>
       </w:r>
     </w:p>
     <w:p>
@@ -800,23 +700,7 @@
           <w:sz w:val="20"/>
           <w:szCs w:val="20"/>
         </w:rPr>
-        <w:t> "</w:t>
-      </w:r>
-      <w:proofErr w:type="spellStart"/>
-      <w:r>
-        <w:rPr>
-          <w:sz w:val="20"/>
-          <w:szCs w:val="20"/>
-        </w:rPr>
-        <w:t>processStatus</w:t>
-      </w:r>
-      <w:proofErr w:type="spellEnd"/>
-      <w:r>
-        <w:rPr>
-          <w:sz w:val="20"/>
-          <w:szCs w:val="20"/>
-        </w:rPr>
-        <w:t>": "Pending"</w:t>
+        <w:t> "processStatus": "Pending"</w:t>
       </w:r>
     </w:p>
     <w:p>
@@ -858,29 +742,11 @@
       <w:r>
         <w:t xml:space="preserve"> for </w:t>
       </w:r>
-      <w:proofErr w:type="spellStart"/>
       <w:r>
         <w:t>processId</w:t>
       </w:r>
-      <w:proofErr w:type="spellEnd"/>
-      <w:r>
-        <w:t xml:space="preserve"> via GET request OR may implement Webhook, </w:t>
-      </w:r>
-      <w:proofErr w:type="spellStart"/>
-      <w:r>
-        <w:t>CallBack</w:t>
-      </w:r>
-      <w:proofErr w:type="spellEnd"/>
-      <w:r>
-        <w:t xml:space="preserve"> endpoint, </w:t>
-      </w:r>
-      <w:proofErr w:type="spellStart"/>
-      <w:r>
-        <w:t>SignalR</w:t>
-      </w:r>
-      <w:proofErr w:type="spellEnd"/>
-      <w:r>
-        <w:t xml:space="preserve"> etc as not polling required.</w:t>
+      <w:r>
+        <w:t xml:space="preserve"> via GET request OR may implement Webhook, CallBack endpoint, SignalR etc as not polling required.</w:t>
       </w:r>
     </w:p>
     <w:p>
@@ -904,23 +770,7 @@
           <w:sz w:val="20"/>
           <w:szCs w:val="20"/>
         </w:rPr>
-        <w:t xml:space="preserve">: </w:t>
-      </w:r>
-      <w:proofErr w:type="spellStart"/>
-      <w:r>
-        <w:rPr>
-          <w:sz w:val="20"/>
-          <w:szCs w:val="20"/>
-        </w:rPr>
-        <w:t>api</w:t>
-      </w:r>
-      <w:proofErr w:type="spellEnd"/>
-      <w:r>
-        <w:rPr>
-          <w:sz w:val="20"/>
-          <w:szCs w:val="20"/>
-        </w:rPr>
-        <w:t>/stream/process</w:t>
+        <w:t>: api/stream/process</w:t>
       </w:r>
       <w:proofErr w:type="gramStart"/>
       <w:r>
@@ -930,7 +780,6 @@
         </w:rPr>
         <w:t>/{</w:t>
       </w:r>
-      <w:proofErr w:type="spellStart"/>
       <w:r>
         <w:rPr>
           <w:sz w:val="20"/>
@@ -938,7 +787,6 @@
         </w:rPr>
         <w:t>processId</w:t>
       </w:r>
-      <w:proofErr w:type="spellEnd"/>
       <w:r>
         <w:rPr>
           <w:sz w:val="20"/>
@@ -1005,23 +853,7 @@
           <w:sz w:val="20"/>
           <w:szCs w:val="20"/>
         </w:rPr>
-        <w:t>"</w:t>
-      </w:r>
-      <w:proofErr w:type="spellStart"/>
-      <w:r>
-        <w:rPr>
-          <w:sz w:val="20"/>
-          <w:szCs w:val="20"/>
-        </w:rPr>
-        <w:t>processId</w:t>
-      </w:r>
-      <w:proofErr w:type="spellEnd"/>
-      <w:r>
-        <w:rPr>
-          <w:sz w:val="20"/>
-          <w:szCs w:val="20"/>
-        </w:rPr>
-        <w:t>": "a8b704a3-8da0-435f-872a-ff1845b41c8c",</w:t>
+        <w:t>"processId": "a8b704a3-8da0-435f-872a-ff1845b41c8c",</w:t>
       </w:r>
     </w:p>
     <w:p>
@@ -1050,23 +882,7 @@
           <w:sz w:val="20"/>
           <w:szCs w:val="20"/>
         </w:rPr>
-        <w:t> "</w:t>
-      </w:r>
-      <w:proofErr w:type="spellStart"/>
-      <w:r>
-        <w:rPr>
-          <w:sz w:val="20"/>
-          <w:szCs w:val="20"/>
-        </w:rPr>
-        <w:t>processStatus</w:t>
-      </w:r>
-      <w:proofErr w:type="spellEnd"/>
-      <w:r>
-        <w:rPr>
-          <w:sz w:val="20"/>
-          <w:szCs w:val="20"/>
-        </w:rPr>
-        <w:t>": "</w:t>
+        <w:t> "processStatus": "</w:t>
       </w:r>
       <w:r>
         <w:rPr>
@@ -1140,11 +956,9 @@
       <w:r>
         <w:t xml:space="preserve"> will get the Output of </w:t>
       </w:r>
-      <w:proofErr w:type="spellStart"/>
       <w:r>
         <w:t>processId</w:t>
       </w:r>
-      <w:proofErr w:type="spellEnd"/>
       <w:r>
         <w:t xml:space="preserve"> via GET request.</w:t>
       </w:r>
@@ -1170,23 +984,7 @@
           <w:sz w:val="20"/>
           <w:szCs w:val="20"/>
         </w:rPr>
-        <w:t xml:space="preserve">: </w:t>
-      </w:r>
-      <w:proofErr w:type="spellStart"/>
-      <w:r>
-        <w:rPr>
-          <w:sz w:val="20"/>
-          <w:szCs w:val="20"/>
-        </w:rPr>
-        <w:t>api</w:t>
-      </w:r>
-      <w:proofErr w:type="spellEnd"/>
-      <w:r>
-        <w:rPr>
-          <w:sz w:val="20"/>
-          <w:szCs w:val="20"/>
-        </w:rPr>
-        <w:t>/stream/process</w:t>
+        <w:t>: api/stream/process</w:t>
       </w:r>
       <w:r>
         <w:rPr>
@@ -1203,7 +1001,6 @@
         </w:rPr>
         <w:t>/{</w:t>
       </w:r>
-      <w:proofErr w:type="spellStart"/>
       <w:r>
         <w:rPr>
           <w:sz w:val="20"/>
@@ -1211,7 +1008,6 @@
         </w:rPr>
         <w:t>processId</w:t>
       </w:r>
-      <w:proofErr w:type="spellEnd"/>
       <w:r>
         <w:rPr>
           <w:sz w:val="20"/>
@@ -1259,23 +1055,7 @@
           <w:sz w:val="20"/>
           <w:szCs w:val="20"/>
         </w:rPr>
-        <w:t>    "</w:t>
-      </w:r>
-      <w:proofErr w:type="spellStart"/>
-      <w:r>
-        <w:rPr>
-          <w:sz w:val="20"/>
-          <w:szCs w:val="20"/>
-        </w:rPr>
-        <w:t>processId</w:t>
-      </w:r>
-      <w:proofErr w:type="spellEnd"/>
-      <w:r>
-        <w:rPr>
-          <w:sz w:val="20"/>
-          <w:szCs w:val="20"/>
-        </w:rPr>
-        <w:t>": "a8b704a3-8da0-435f-872a-ff1845b41c8c",</w:t>
+        <w:t>    "processId": "a8b704a3-8da0-435f-872a-ff1845b41c8c",</w:t>
       </w:r>
     </w:p>
     <w:p>
@@ -1305,23 +1085,7 @@
           <w:sz w:val="20"/>
           <w:szCs w:val="20"/>
         </w:rPr>
-        <w:t>    "</w:t>
-      </w:r>
-      <w:proofErr w:type="spellStart"/>
-      <w:r>
-        <w:rPr>
-          <w:sz w:val="20"/>
-          <w:szCs w:val="20"/>
-        </w:rPr>
-        <w:t>outputData</w:t>
-      </w:r>
-      <w:proofErr w:type="spellEnd"/>
-      <w:r>
-        <w:rPr>
-          <w:sz w:val="20"/>
-          <w:szCs w:val="20"/>
-        </w:rPr>
-        <w:t>": [1, 2, 3, 1, 5, 6</w:t>
+        <w:t>    "outputData": [1, 2, 3, 1, 5, 6</w:t>
       </w:r>
       <w:r>
         <w:rPr>
@@ -1366,23 +1130,7 @@
           <w:sz w:val="20"/>
           <w:szCs w:val="20"/>
         </w:rPr>
-        <w:t>    "</w:t>
-      </w:r>
-      <w:proofErr w:type="spellStart"/>
-      <w:r>
-        <w:rPr>
-          <w:sz w:val="20"/>
-          <w:szCs w:val="20"/>
-        </w:rPr>
-        <w:t>processStatus</w:t>
-      </w:r>
-      <w:proofErr w:type="spellEnd"/>
-      <w:r>
-        <w:rPr>
-          <w:sz w:val="20"/>
-          <w:szCs w:val="20"/>
-        </w:rPr>
-        <w:t>": "Completed"</w:t>
+        <w:t>    "processStatus": "Completed"</w:t>
       </w:r>
     </w:p>
     <w:p>
@@ -1408,24 +1156,17 @@
           <w:numId w:val="3"/>
         </w:numPr>
       </w:pPr>
-      <w:proofErr w:type="spellStart"/>
       <w:r>
         <w:t>Streaming.Processor</w:t>
       </w:r>
-      <w:proofErr w:type="spellEnd"/>
     </w:p>
     <w:p>
       <w:r>
         <w:t xml:space="preserve">This is the worker process and process the request via </w:t>
       </w:r>
-      <w:proofErr w:type="spellStart"/>
       <w:proofErr w:type="gramStart"/>
       <w:r>
-        <w:t>RabbitMq</w:t>
-      </w:r>
-      <w:proofErr w:type="spellEnd"/>
-      <w:r>
-        <w:t xml:space="preserve">  queue</w:t>
+        <w:t>RabbitMq  queue</w:t>
       </w:r>
       <w:proofErr w:type="gramEnd"/>
       <w:r>
@@ -1433,24 +1174,11 @@
       </w:r>
       <w:proofErr w:type="gramStart"/>
       <w:r>
-        <w:t xml:space="preserve">in  </w:t>
-      </w:r>
-      <w:proofErr w:type="spellStart"/>
-      <w:r>
-        <w:t>NoSql</w:t>
-      </w:r>
-      <w:proofErr w:type="spellEnd"/>
+        <w:t>in  NoSql</w:t>
+      </w:r>
       <w:proofErr w:type="gramEnd"/>
       <w:r>
-        <w:t xml:space="preserve"> </w:t>
-      </w:r>
-      <w:proofErr w:type="spellStart"/>
-      <w:r>
-        <w:t>db</w:t>
-      </w:r>
-      <w:proofErr w:type="spellEnd"/>
-      <w:r>
-        <w:t xml:space="preserve"> with status as </w:t>
+        <w:t xml:space="preserve"> db with status as </w:t>
       </w:r>
       <w:r>
         <w:t>Completed</w:t>
@@ -1604,11 +1332,9 @@
           <w:numId w:val="1"/>
         </w:numPr>
       </w:pPr>
-      <w:proofErr w:type="spellStart"/>
       <w:r>
         <w:t>MongoDB.Driver</w:t>
       </w:r>
-      <w:proofErr w:type="spellEnd"/>
     </w:p>
     <w:p>
       <w:pPr>
@@ -1617,11 +1343,9 @@
           <w:numId w:val="1"/>
         </w:numPr>
       </w:pPr>
-      <w:proofErr w:type="spellStart"/>
       <w:r>
         <w:t>MassTransit</w:t>
       </w:r>
-      <w:proofErr w:type="spellEnd"/>
     </w:p>
     <w:p>
       <w:pPr>
@@ -1672,6 +1396,27 @@
     <w:p>
       <w:r>
         <w:t>docker-compose up -d</w:t>
+      </w:r>
+    </w:p>
+    <w:p/>
+    <w:p>
+      <w:r>
+        <w:t xml:space="preserve">add kibana and Elastic logging </w:t>
+      </w:r>
+    </w:p>
+    <w:p>
+      <w:hyperlink r:id="rId8" w:history="1">
+        <w:r>
+          <w:rPr>
+            <w:rStyle w:val="Hyperlink"/>
+          </w:rPr>
+          <w:t>http://localhost:5601/</w:t>
+        </w:r>
+      </w:hyperlink>
+    </w:p>
+    <w:p>
+      <w:r>
+        <w:t>http://localhost:9200/_cat/indices?v</w:t>
       </w:r>
     </w:p>
     <w:p/>
@@ -3069,6 +2814,7 @@
   <w:style w:type="character" w:default="1" w:styleId="DefaultParagraphFont">
     <w:name w:val="Default Paragraph Font"/>
     <w:uiPriority w:val="1"/>
+    <w:semiHidden/>
     <w:unhideWhenUsed/>
   </w:style>
   <w:style w:type="table" w:default="1" w:styleId="TableNormal">
@@ -3379,6 +3125,29 @@
       <w:smallCaps/>
       <w:color w:val="0F4761" w:themeColor="accent1" w:themeShade="BF"/>
       <w:spacing w:val="5"/>
+    </w:rPr>
+  </w:style>
+  <w:style w:type="character" w:styleId="Hyperlink">
+    <w:name w:val="Hyperlink"/>
+    <w:basedOn w:val="DefaultParagraphFont"/>
+    <w:uiPriority w:val="99"/>
+    <w:unhideWhenUsed/>
+    <w:rsid w:val="00755E49"/>
+    <w:rPr>
+      <w:color w:val="467886" w:themeColor="hyperlink"/>
+      <w:u w:val="single"/>
+    </w:rPr>
+  </w:style>
+  <w:style w:type="character" w:styleId="UnresolvedMention">
+    <w:name w:val="Unresolved Mention"/>
+    <w:basedOn w:val="DefaultParagraphFont"/>
+    <w:uiPriority w:val="99"/>
+    <w:semiHidden/>
+    <w:unhideWhenUsed/>
+    <w:rsid w:val="00755E49"/>
+    <w:rPr>
+      <w:color w:val="605E5C"/>
+      <w:shd w:val="clear" w:color="auto" w:fill="E1DFDD"/>
     </w:rPr>
   </w:style>
 </w:styles>

</xml_diff>